<commit_message>
Update ALLOWED_HOSTS to include Vercel URL
</commit_message>
<xml_diff>
--- a/lab-devops/Toutes_les_photos.docx
+++ b/lab-devops/Toutes_les_photos.docx
@@ -174,6 +174,9 @@
     </w:p>
     <w:p>
       <w:r>
+        <w:rPr>
+          <w:noProof/>
+        </w:rPr>
         <w:drawing>
           <wp:inline distT="0" distB="0" distL="0" distR="0" wp14:anchorId="6DF652E1" wp14:editId="788A7CAC">
             <wp:extent cx="5760720" cy="3496310"/>
@@ -213,6 +216,62 @@
     </w:p>
     <w:p/>
     <w:p/>
+    <w:p/>
+    <w:p/>
+    <w:p/>
+    <w:p>
+      <w:pPr>
+        <w:rPr>
+          <w:u w:val="single"/>
+        </w:rPr>
+      </w:pPr>
+      <w:r>
+        <w:rPr>
+          <w:u w:val="single"/>
+        </w:rPr>
+        <w:lastRenderedPageBreak/>
+        <w:t xml:space="preserve">Erreur rencontrée </w:t>
+      </w:r>
+    </w:p>
+    <w:p>
+      <w:r>
+        <w:drawing>
+          <wp:inline distT="0" distB="0" distL="0" distR="0" wp14:anchorId="17320E87" wp14:editId="020C1892">
+            <wp:extent cx="5760720" cy="3599815"/>
+            <wp:effectExtent l="0" t="0" r="0" b="635"/>
+            <wp:docPr id="553016074" name="Image 1" descr="The image displays a dual-screen setup with a web browser window on the left, showcasing a code editor interface for a Django web application project on the right. The left side shows a list of files and folders related to a web deployment, such as `vercel.json`, `settings.py`, and `Dockerfile`. The right side includes an error message indicating a security warning about `DEBUG = True` and an invalid `HTTP_HOST` header.&#10;&#10;Le contenu généré par l’IA peut être incorrect."/>
+            <wp:cNvGraphicFramePr>
+              <a:graphicFrameLocks xmlns:a="http://schemas.openxmlformats.org/drawingml/2006/main" noChangeAspect="1"/>
+            </wp:cNvGraphicFramePr>
+            <a:graphic xmlns:a="http://schemas.openxmlformats.org/drawingml/2006/main">
+              <a:graphicData uri="http://schemas.openxmlformats.org/drawingml/2006/picture">
+                <pic:pic xmlns:pic="http://schemas.openxmlformats.org/drawingml/2006/picture">
+                  <pic:nvPicPr>
+                    <pic:cNvPr id="553016074" name="Image 1" descr="The image displays a dual-screen setup with a web browser window on the left, showcasing a code editor interface for a Django web application project on the right. The left side shows a list of files and folders related to a web deployment, such as `vercel.json`, `settings.py`, and `Dockerfile`. The right side includes an error message indicating a security warning about `DEBUG = True` and an invalid `HTTP_HOST` header.&#10;&#10;Le contenu généré par l’IA peut être incorrect."/>
+                    <pic:cNvPicPr/>
+                  </pic:nvPicPr>
+                  <pic:blipFill>
+                    <a:blip r:embed="rId5"/>
+                    <a:stretch>
+                      <a:fillRect/>
+                    </a:stretch>
+                  </pic:blipFill>
+                  <pic:spPr>
+                    <a:xfrm>
+                      <a:off x="0" y="0"/>
+                      <a:ext cx="5760720" cy="3599815"/>
+                    </a:xfrm>
+                    <a:prstGeom prst="rect">
+                      <a:avLst/>
+                    </a:prstGeom>
+                  </pic:spPr>
+                </pic:pic>
+              </a:graphicData>
+            </a:graphic>
+          </wp:inline>
+        </w:drawing>
+      </w:r>
+    </w:p>
     <w:sectPr>
       <w:pgSz w:w="11906" w:h="16838"/>
       <w:pgMar w:top="1417" w:right="1417" w:bottom="1417" w:left="1417" w:header="708" w:footer="708" w:gutter="0"/>
@@ -826,6 +885,7 @@
   <w:style w:type="character" w:default="1" w:styleId="Policepardfaut">
     <w:name w:val="Default Paragraph Font"/>
     <w:uiPriority w:val="1"/>
+    <w:semiHidden/>
     <w:unhideWhenUsed/>
   </w:style>
   <w:style w:type="table" w:default="1" w:styleId="TableauNormal">

</xml_diff>

<commit_message>
Intégration de Sentry pour le suivi des erreurs
</commit_message>
<xml_diff>
--- a/lab-devops/Toutes_les_photos.docx
+++ b/lab-devops/Toutes_les_photos.docx
@@ -171,6 +171,12 @@
         <w:t>develp</w:t>
       </w:r>
       <w:proofErr w:type="spellEnd"/>
+      <w:r>
+        <w:rPr>
+          <w:u w:val="single"/>
+        </w:rPr>
+        <w:t>-</w:t>
+      </w:r>
     </w:p>
     <w:p>
       <w:r>
@@ -230,10 +236,27 @@
           <w:u w:val="single"/>
         </w:rPr>
         <w:lastRenderedPageBreak/>
-        <w:t xml:space="preserve">Erreur rencontrée </w:t>
+        <w:t>Erreur rencontrée</w:t>
+      </w:r>
+      <w:r>
+        <w:rPr>
+          <w:u w:val="single"/>
+        </w:rPr>
+        <w:t> :</w:t>
+      </w:r>
+      <w:r>
+        <w:rPr>
+          <w:u w:val="single"/>
+        </w:rPr>
+        <w:t xml:space="preserve"> </w:t>
       </w:r>
     </w:p>
     <w:p>
+      <w:pPr>
+        <w:rPr>
+          <w:u w:val="single"/>
+        </w:rPr>
+      </w:pPr>
       <w:r>
         <w:drawing>
           <wp:inline distT="0" distB="0" distL="0" distR="0" wp14:anchorId="17320E87" wp14:editId="020C1892">
@@ -260,6 +283,167 @@
                     <a:xfrm>
                       <a:off x="0" y="0"/>
                       <a:ext cx="5760720" cy="3599815"/>
+                    </a:xfrm>
+                    <a:prstGeom prst="rect">
+                      <a:avLst/>
+                    </a:prstGeom>
+                  </pic:spPr>
+                </pic:pic>
+              </a:graphicData>
+            </a:graphic>
+          </wp:inline>
+        </w:drawing>
+      </w:r>
+      <w:r>
+        <w:br/>
+      </w:r>
+      <w:r>
+        <w:br/>
+      </w:r>
+      <w:r>
+        <w:rPr>
+          <w:u w:val="single"/>
+        </w:rPr>
+        <w:lastRenderedPageBreak/>
+        <w:t>Erreur fixée :</w:t>
+      </w:r>
+      <w:r>
+        <w:br/>
+      </w:r>
+      <w:r>
+        <w:drawing>
+          <wp:inline distT="0" distB="0" distL="0" distR="0" wp14:anchorId="50DE577E" wp14:editId="1FC60D30">
+            <wp:extent cx="5760720" cy="6348095"/>
+            <wp:effectExtent l="0" t="0" r="0" b="0"/>
+            <wp:docPr id="1754378866" name="Image 1" descr="The image shows a user interface for a deployment management system, indicating that a deployment is active, with a message that maintenance is ongoing, and a link to the deployment page.&#10;&#10;Le contenu généré par l’IA peut être incorrect."/>
+            <wp:cNvGraphicFramePr>
+              <a:graphicFrameLocks xmlns:a="http://schemas.openxmlformats.org/drawingml/2006/main" noChangeAspect="1"/>
+            </wp:cNvGraphicFramePr>
+            <a:graphic xmlns:a="http://schemas.openxmlformats.org/drawingml/2006/main">
+              <a:graphicData uri="http://schemas.openxmlformats.org/drawingml/2006/picture">
+                <pic:pic xmlns:pic="http://schemas.openxmlformats.org/drawingml/2006/picture">
+                  <pic:nvPicPr>
+                    <pic:cNvPr id="1754378866" name="Image 1" descr="The image shows a user interface for a deployment management system, indicating that a deployment is active, with a message that maintenance is ongoing, and a link to the deployment page.&#10;&#10;Le contenu généré par l’IA peut être incorrect."/>
+                    <pic:cNvPicPr/>
+                  </pic:nvPicPr>
+                  <pic:blipFill>
+                    <a:blip r:embed="rId6"/>
+                    <a:stretch>
+                      <a:fillRect/>
+                    </a:stretch>
+                  </pic:blipFill>
+                  <pic:spPr>
+                    <a:xfrm>
+                      <a:off x="0" y="0"/>
+                      <a:ext cx="5760720" cy="6348095"/>
+                    </a:xfrm>
+                    <a:prstGeom prst="rect">
+                      <a:avLst/>
+                    </a:prstGeom>
+                  </pic:spPr>
+                </pic:pic>
+              </a:graphicData>
+            </a:graphic>
+          </wp:inline>
+        </w:drawing>
+      </w:r>
+    </w:p>
+    <w:p>
+      <w:pPr>
+        <w:rPr>
+          <w:u w:val="single"/>
+        </w:rPr>
+      </w:pPr>
+    </w:p>
+    <w:p>
+      <w:pPr>
+        <w:rPr>
+          <w:u w:val="single"/>
+        </w:rPr>
+      </w:pPr>
+    </w:p>
+    <w:p>
+      <w:pPr>
+        <w:rPr>
+          <w:u w:val="single"/>
+        </w:rPr>
+      </w:pPr>
+    </w:p>
+    <w:p>
+      <w:pPr>
+        <w:rPr>
+          <w:u w:val="single"/>
+        </w:rPr>
+      </w:pPr>
+    </w:p>
+    <w:p>
+      <w:pPr>
+        <w:rPr>
+          <w:u w:val="single"/>
+        </w:rPr>
+      </w:pPr>
+    </w:p>
+    <w:p>
+      <w:pPr>
+        <w:rPr>
+          <w:u w:val="single"/>
+        </w:rPr>
+      </w:pPr>
+    </w:p>
+    <w:p>
+      <w:pPr>
+        <w:rPr>
+          <w:u w:val="single"/>
+        </w:rPr>
+      </w:pPr>
+    </w:p>
+    <w:p/>
+    <w:p>
+      <w:pPr>
+        <w:rPr>
+          <w:u w:val="single"/>
+        </w:rPr>
+      </w:pPr>
+      <w:r>
+        <w:rPr>
+          <w:u w:val="single"/>
+        </w:rPr>
+        <w:t>Configuration de la vue</w:t>
+      </w:r>
+      <w:r>
+        <w:rPr>
+          <w:u w:val="single"/>
+        </w:rPr>
+        <w:t> :</w:t>
+      </w:r>
+    </w:p>
+    <w:p>
+      <w:r>
+        <w:drawing>
+          <wp:inline distT="0" distB="0" distL="0" distR="0" wp14:anchorId="5F9A26F5" wp14:editId="15D98A0D">
+            <wp:extent cx="5760720" cy="3646805"/>
+            <wp:effectExtent l="0" t="0" r="0" b="0"/>
+            <wp:docPr id="440682778" name="Image 1" descr="The image displays a screen from an integrated development environment (IDE) interface, specifically the Visual Studio Code, showing a configuration or setup page for the Sentry SDK in a Django project.&#10;&#10;Le contenu généré par l’IA peut être incorrect."/>
+            <wp:cNvGraphicFramePr>
+              <a:graphicFrameLocks xmlns:a="http://schemas.openxmlformats.org/drawingml/2006/main" noChangeAspect="1"/>
+            </wp:cNvGraphicFramePr>
+            <a:graphic xmlns:a="http://schemas.openxmlformats.org/drawingml/2006/main">
+              <a:graphicData uri="http://schemas.openxmlformats.org/drawingml/2006/picture">
+                <pic:pic xmlns:pic="http://schemas.openxmlformats.org/drawingml/2006/picture">
+                  <pic:nvPicPr>
+                    <pic:cNvPr id="440682778" name="Image 1" descr="The image displays a screen from an integrated development environment (IDE) interface, specifically the Visual Studio Code, showing a configuration or setup page for the Sentry SDK in a Django project.&#10;&#10;Le contenu généré par l’IA peut être incorrect."/>
+                    <pic:cNvPicPr/>
+                  </pic:nvPicPr>
+                  <pic:blipFill>
+                    <a:blip r:embed="rId7"/>
+                    <a:stretch>
+                      <a:fillRect/>
+                    </a:stretch>
+                  </pic:blipFill>
+                  <pic:spPr>
+                    <a:xfrm>
+                      <a:off x="0" y="0"/>
+                      <a:ext cx="5760720" cy="3646805"/>
                     </a:xfrm>
                     <a:prstGeom prst="rect">
                       <a:avLst/>

</xml_diff>

<commit_message>
ajout du word avec les photos demandées
</commit_message>
<xml_diff>
--- a/lab-devops/Toutes_les_photos.docx
+++ b/lab-devops/Toutes_les_photos.docx
@@ -96,6 +96,8 @@
     <w:p>
       <w:pPr>
         <w:rPr>
+          <w:b/>
+          <w:bCs/>
           <w:u w:val="single"/>
         </w:rPr>
       </w:pPr>
@@ -123,21 +125,212 @@
         </w:rPr>
         <w:br/>
       </w:r>
-      <w:r>
-        <w:rPr>
-          <w:u w:val="single"/>
-        </w:rPr>
+    </w:p>
+    <w:p>
+      <w:pPr>
+        <w:rPr>
+          <w:b/>
+          <w:bCs/>
+          <w:u w:val="single"/>
+        </w:rPr>
+      </w:pPr>
+      <w:r>
+        <w:rPr>
+          <w:b/>
+          <w:bCs/>
+          <w:u w:val="single"/>
+        </w:rPr>
+        <w:t>Lien GitHub du projet :</w:t>
+      </w:r>
+      <w:r>
+        <w:rPr>
+          <w:b/>
+          <w:bCs/>
+          <w:u w:val="single"/>
+        </w:rPr>
+        <w:t xml:space="preserve"> </w:t>
+      </w:r>
+      <w:hyperlink r:id="rId4" w:history="1">
+        <w:r>
+          <w:rPr>
+            <w:rStyle w:val="Lienhypertexte"/>
+            <w:b/>
+            <w:bCs/>
+          </w:rPr>
+          <w:t>https://github.com/Pierre-Claver-Pro/TP_CI-CD-Pierre_KOFFI</w:t>
+        </w:r>
+      </w:hyperlink>
+    </w:p>
+    <w:p>
+      <w:pPr>
+        <w:rPr>
+          <w:b/>
+          <w:bCs/>
+          <w:u w:val="single"/>
+        </w:rPr>
+      </w:pPr>
+    </w:p>
+    <w:p>
+      <w:pPr>
+        <w:rPr>
+          <w:b/>
+          <w:bCs/>
+          <w:u w:val="single"/>
+        </w:rPr>
+      </w:pPr>
+    </w:p>
+    <w:p>
+      <w:pPr>
+        <w:rPr>
+          <w:b/>
+          <w:bCs/>
+          <w:u w:val="single"/>
+        </w:rPr>
+      </w:pPr>
+    </w:p>
+    <w:p>
+      <w:pPr>
+        <w:rPr>
+          <w:b/>
+          <w:bCs/>
+          <w:u w:val="single"/>
+        </w:rPr>
+      </w:pPr>
+    </w:p>
+    <w:p>
+      <w:pPr>
+        <w:rPr>
+          <w:b/>
+          <w:bCs/>
+          <w:u w:val="single"/>
+        </w:rPr>
+      </w:pPr>
+    </w:p>
+    <w:p>
+      <w:pPr>
+        <w:rPr>
+          <w:b/>
+          <w:bCs/>
+          <w:u w:val="single"/>
+        </w:rPr>
+      </w:pPr>
+    </w:p>
+    <w:p>
+      <w:pPr>
+        <w:rPr>
+          <w:b/>
+          <w:bCs/>
+          <w:sz w:val="48"/>
+          <w:szCs w:val="48"/>
+          <w:u w:val="single"/>
+        </w:rPr>
+      </w:pPr>
+    </w:p>
+    <w:p>
+      <w:pPr>
+        <w:rPr>
+          <w:b/>
+          <w:bCs/>
+          <w:sz w:val="48"/>
+          <w:szCs w:val="48"/>
+          <w:u w:val="single"/>
+        </w:rPr>
+      </w:pPr>
+      <w:r>
+        <w:rPr>
+          <w:b/>
+          <w:bCs/>
+          <w:sz w:val="48"/>
+          <w:szCs w:val="48"/>
+          <w:u w:val="single"/>
+        </w:rPr>
+        <w:t>Les différentes captures d’écran :</w:t>
+      </w:r>
+    </w:p>
+    <w:p>
+      <w:pPr>
+        <w:rPr>
+          <w:b/>
+          <w:bCs/>
+          <w:u w:val="single"/>
+        </w:rPr>
+      </w:pPr>
+    </w:p>
+    <w:p>
+      <w:pPr>
+        <w:rPr>
+          <w:b/>
+          <w:bCs/>
+          <w:u w:val="single"/>
+        </w:rPr>
+      </w:pPr>
+    </w:p>
+    <w:p>
+      <w:pPr>
+        <w:rPr>
+          <w:b/>
+          <w:bCs/>
+          <w:u w:val="single"/>
+        </w:rPr>
+      </w:pPr>
+    </w:p>
+    <w:p>
+      <w:pPr>
+        <w:rPr>
+          <w:b/>
+          <w:bCs/>
+          <w:u w:val="single"/>
+        </w:rPr>
+      </w:pPr>
+    </w:p>
+    <w:p>
+      <w:pPr>
+        <w:rPr>
+          <w:b/>
+          <w:bCs/>
+          <w:u w:val="single"/>
+        </w:rPr>
+      </w:pPr>
+    </w:p>
+    <w:p>
+      <w:pPr>
+        <w:rPr>
+          <w:b/>
+          <w:bCs/>
+          <w:u w:val="single"/>
+        </w:rPr>
+      </w:pPr>
+    </w:p>
+    <w:p>
+      <w:pPr>
+        <w:rPr>
+          <w:b/>
+          <w:bCs/>
+          <w:u w:val="single"/>
+        </w:rPr>
+      </w:pPr>
+    </w:p>
+    <w:p>
+      <w:pPr>
+        <w:rPr>
+          <w:u w:val="single"/>
+        </w:rPr>
+      </w:pPr>
+      <w:r>
+        <w:rPr>
+          <w:b/>
+          <w:bCs/>
+          <w:u w:val="single"/>
+        </w:rPr>
+        <w:lastRenderedPageBreak/>
         <w:br/>
-      </w:r>
-      <w:r>
-        <w:rPr>
-          <w:u w:val="single"/>
-        </w:rPr>
         <w:t xml:space="preserve">Comparaison entre ma </w:t>
       </w:r>
       <w:proofErr w:type="spellStart"/>
       <w:r>
         <w:rPr>
+          <w:b/>
+          <w:bCs/>
           <w:u w:val="single"/>
         </w:rPr>
         <w:t>branch</w:t>
@@ -145,6 +338,8 @@
       <w:proofErr w:type="spellEnd"/>
       <w:r>
         <w:rPr>
+          <w:b/>
+          <w:bCs/>
           <w:u w:val="single"/>
         </w:rPr>
         <w:t xml:space="preserve"> master et le </w:t>
@@ -152,6 +347,8 @@
       <w:proofErr w:type="spellStart"/>
       <w:r>
         <w:rPr>
+          <w:b/>
+          <w:bCs/>
           <w:u w:val="single"/>
         </w:rPr>
         <w:t>branch</w:t>
@@ -159,6 +356,8 @@
       <w:proofErr w:type="spellEnd"/>
       <w:r>
         <w:rPr>
+          <w:b/>
+          <w:bCs/>
           <w:u w:val="single"/>
         </w:rPr>
         <w:t xml:space="preserve"> </w:t>
@@ -166,16 +365,28 @@
       <w:proofErr w:type="spellStart"/>
       <w:r>
         <w:rPr>
-          <w:u w:val="single"/>
-        </w:rPr>
-        <w:t>develp</w:t>
+          <w:b/>
+          <w:bCs/>
+          <w:u w:val="single"/>
+        </w:rPr>
+        <w:t>devel</w:t>
+      </w:r>
+      <w:r>
+        <w:rPr>
+          <w:b/>
+          <w:bCs/>
+          <w:u w:val="single"/>
+        </w:rPr>
+        <w:t>op</w:t>
       </w:r>
       <w:proofErr w:type="spellEnd"/>
       <w:r>
         <w:rPr>
-          <w:u w:val="single"/>
-        </w:rPr>
-        <w:t>-</w:t>
+          <w:b/>
+          <w:bCs/>
+          <w:u w:val="single"/>
+        </w:rPr>
+        <w:t>.</w:t>
       </w:r>
     </w:p>
     <w:p>
@@ -199,7 +410,7 @@
                     <pic:cNvPicPr/>
                   </pic:nvPicPr>
                   <pic:blipFill>
-                    <a:blip r:embed="rId4"/>
+                    <a:blip r:embed="rId5"/>
                     <a:stretch>
                       <a:fillRect/>
                     </a:stretch>
@@ -221,31 +432,34 @@
       </w:r>
     </w:p>
     <w:p/>
-    <w:p/>
-    <w:p/>
-    <w:p/>
-    <w:p/>
-    <w:p>
-      <w:pPr>
-        <w:rPr>
-          <w:u w:val="single"/>
-        </w:rPr>
-      </w:pPr>
-      <w:r>
-        <w:rPr>
-          <w:u w:val="single"/>
-        </w:rPr>
-        <w:lastRenderedPageBreak/>
+    <w:p>
+      <w:pPr>
+        <w:rPr>
+          <w:b/>
+          <w:bCs/>
+          <w:u w:val="single"/>
+        </w:rPr>
+      </w:pPr>
+      <w:r>
+        <w:rPr>
+          <w:b/>
+          <w:bCs/>
+          <w:u w:val="single"/>
+        </w:rPr>
         <w:t>Erreur rencontrée</w:t>
       </w:r>
       <w:r>
         <w:rPr>
+          <w:b/>
+          <w:bCs/>
           <w:u w:val="single"/>
         </w:rPr>
         <w:t> :</w:t>
       </w:r>
       <w:r>
         <w:rPr>
+          <w:b/>
+          <w:bCs/>
           <w:u w:val="single"/>
         </w:rPr>
         <w:t xml:space="preserve"> </w:t>
@@ -274,7 +488,7 @@
                     <pic:cNvPicPr/>
                   </pic:nvPicPr>
                   <pic:blipFill>
-                    <a:blip r:embed="rId5"/>
+                    <a:blip r:embed="rId6"/>
                     <a:stretch>
                       <a:fillRect/>
                     </a:stretch>
@@ -302,6 +516,8 @@
       </w:r>
       <w:r>
         <w:rPr>
+          <w:b/>
+          <w:bCs/>
           <w:u w:val="single"/>
         </w:rPr>
         <w:lastRenderedPageBreak/>
@@ -327,7 +543,7 @@
                     <pic:cNvPicPr/>
                   </pic:nvPicPr>
                   <pic:blipFill>
-                    <a:blip r:embed="rId6"/>
+                    <a:blip r:embed="rId7"/>
                     <a:stretch>
                       <a:fillRect/>
                     </a:stretch>
@@ -401,23 +617,36 @@
     <w:p>
       <w:pPr>
         <w:rPr>
-          <w:u w:val="single"/>
-        </w:rPr>
-      </w:pPr>
-      <w:r>
-        <w:rPr>
+          <w:b/>
+          <w:bCs/>
+          <w:u w:val="single"/>
+        </w:rPr>
+      </w:pPr>
+      <w:r>
+        <w:rPr>
+          <w:b/>
+          <w:bCs/>
           <w:u w:val="single"/>
         </w:rPr>
         <w:t>Configuration de la vue</w:t>
       </w:r>
       <w:r>
         <w:rPr>
+          <w:b/>
+          <w:bCs/>
           <w:u w:val="single"/>
         </w:rPr>
         <w:t> :</w:t>
       </w:r>
     </w:p>
     <w:p>
+      <w:pPr>
+        <w:rPr>
+          <w:b/>
+          <w:bCs/>
+          <w:u w:val="single"/>
+        </w:rPr>
+      </w:pPr>
       <w:r>
         <w:drawing>
           <wp:inline distT="0" distB="0" distL="0" distR="0" wp14:anchorId="5F9A26F5" wp14:editId="15D98A0D">
@@ -435,7 +664,7 @@
                     <pic:cNvPicPr/>
                   </pic:nvPicPr>
                   <pic:blipFill>
-                    <a:blip r:embed="rId7"/>
+                    <a:blip r:embed="rId8"/>
                     <a:stretch>
                       <a:fillRect/>
                     </a:stretch>
@@ -444,6 +673,187 @@
                     <a:xfrm>
                       <a:off x="0" y="0"/>
                       <a:ext cx="5760720" cy="3646805"/>
+                    </a:xfrm>
+                    <a:prstGeom prst="rect">
+                      <a:avLst/>
+                    </a:prstGeom>
+                  </pic:spPr>
+                </pic:pic>
+              </a:graphicData>
+            </a:graphic>
+          </wp:inline>
+        </w:drawing>
+      </w:r>
+      <w:r>
+        <w:br/>
+      </w:r>
+      <w:r>
+        <w:br/>
+      </w:r>
+      <w:r>
+        <w:rPr>
+          <w:b/>
+          <w:bCs/>
+        </w:rPr>
+        <w:br/>
+        <w:t>Déploiement :</w:t>
+      </w:r>
+      <w:r>
+        <w:br/>
+      </w:r>
+      <w:r>
+        <w:br/>
+      </w:r>
+      <w:r>
+        <w:drawing>
+          <wp:inline distT="0" distB="0" distL="0" distR="0" wp14:anchorId="6C9E5BD4" wp14:editId="4ABB389F">
+            <wp:extent cx="5760720" cy="3361055"/>
+            <wp:effectExtent l="0" t="0" r="0" b="0"/>
+            <wp:docPr id="1203433972" name="Image 1" descr="The image displays a web page interface with error messages, including a connection issue to the data server, and various sections for project management and monitoring.&#10;&#10;Le contenu généré par l’IA peut être incorrect."/>
+            <wp:cNvGraphicFramePr>
+              <a:graphicFrameLocks xmlns:a="http://schemas.openxmlformats.org/drawingml/2006/main" noChangeAspect="1"/>
+            </wp:cNvGraphicFramePr>
+            <a:graphic xmlns:a="http://schemas.openxmlformats.org/drawingml/2006/main">
+              <a:graphicData uri="http://schemas.openxmlformats.org/drawingml/2006/picture">
+                <pic:pic xmlns:pic="http://schemas.openxmlformats.org/drawingml/2006/picture">
+                  <pic:nvPicPr>
+                    <pic:cNvPr id="1203433972" name="Image 1" descr="The image displays a web page interface with error messages, including a connection issue to the data server, and various sections for project management and monitoring.&#10;&#10;Le contenu généré par l’IA peut être incorrect."/>
+                    <pic:cNvPicPr/>
+                  </pic:nvPicPr>
+                  <pic:blipFill>
+                    <a:blip r:embed="rId9"/>
+                    <a:stretch>
+                      <a:fillRect/>
+                    </a:stretch>
+                  </pic:blipFill>
+                  <pic:spPr>
+                    <a:xfrm>
+                      <a:off x="0" y="0"/>
+                      <a:ext cx="5760720" cy="3361055"/>
+                    </a:xfrm>
+                    <a:prstGeom prst="rect">
+                      <a:avLst/>
+                    </a:prstGeom>
+                  </pic:spPr>
+                </pic:pic>
+              </a:graphicData>
+            </a:graphic>
+          </wp:inline>
+        </w:drawing>
+      </w:r>
+      <w:r>
+        <w:br/>
+      </w:r>
+    </w:p>
+    <w:p>
+      <w:r>
+        <w:rPr>
+          <w:b/>
+          <w:bCs/>
+          <w:u w:val="single"/>
+        </w:rPr>
+        <w:lastRenderedPageBreak/>
+        <w:t>Erreur rencontrée :</w:t>
+      </w:r>
+      <w:r>
+        <w:br/>
+      </w:r>
+      <w:r>
+        <w:drawing>
+          <wp:inline distT="0" distB="0" distL="0" distR="0" wp14:anchorId="1208534D" wp14:editId="31AD7E00">
+            <wp:extent cx="5760720" cy="4444365"/>
+            <wp:effectExtent l="0" t="0" r="0" b="0"/>
+            <wp:docPr id="202527498" name="Image 1" descr="The image appears to be a dashboard interface for a project management or issue tracking system, with sections for issues, warnings, events, and configurations, including a specific error message about a division by zero.&#10;&#10;Le contenu généré par l’IA peut être incorrect."/>
+            <wp:cNvGraphicFramePr>
+              <a:graphicFrameLocks xmlns:a="http://schemas.openxmlformats.org/drawingml/2006/main" noChangeAspect="1"/>
+            </wp:cNvGraphicFramePr>
+            <a:graphic xmlns:a="http://schemas.openxmlformats.org/drawingml/2006/main">
+              <a:graphicData uri="http://schemas.openxmlformats.org/drawingml/2006/picture">
+                <pic:pic xmlns:pic="http://schemas.openxmlformats.org/drawingml/2006/picture">
+                  <pic:nvPicPr>
+                    <pic:cNvPr id="202527498" name="Image 1" descr="The image appears to be a dashboard interface for a project management or issue tracking system, with sections for issues, warnings, events, and configurations, including a specific error message about a division by zero.&#10;&#10;Le contenu généré par l’IA peut être incorrect."/>
+                    <pic:cNvPicPr/>
+                  </pic:nvPicPr>
+                  <pic:blipFill>
+                    <a:blip r:embed="rId10"/>
+                    <a:stretch>
+                      <a:fillRect/>
+                    </a:stretch>
+                  </pic:blipFill>
+                  <pic:spPr>
+                    <a:xfrm>
+                      <a:off x="0" y="0"/>
+                      <a:ext cx="5760720" cy="4444365"/>
+                    </a:xfrm>
+                    <a:prstGeom prst="rect">
+                      <a:avLst/>
+                    </a:prstGeom>
+                  </pic:spPr>
+                </pic:pic>
+              </a:graphicData>
+            </a:graphic>
+          </wp:inline>
+        </w:drawing>
+      </w:r>
+      <w:r>
+        <w:rPr>
+          <w:b/>
+          <w:bCs/>
+          <w:u w:val="single"/>
+        </w:rPr>
+        <w:br/>
+      </w:r>
+      <w:r>
+        <w:rPr>
+          <w:b/>
+          <w:bCs/>
+          <w:u w:val="single"/>
+        </w:rPr>
+        <w:br/>
+      </w:r>
+      <w:r>
+        <w:rPr>
+          <w:b/>
+          <w:bCs/>
+          <w:u w:val="single"/>
+        </w:rPr>
+        <w:lastRenderedPageBreak/>
+        <w:t>Erreur fixée :</w:t>
+      </w:r>
+      <w:r>
+        <w:rPr>
+          <w:b/>
+          <w:bCs/>
+          <w:u w:val="single"/>
+        </w:rPr>
+        <w:br/>
+      </w:r>
+      <w:r>
+        <w:drawing>
+          <wp:inline distT="0" distB="0" distL="0" distR="0" wp14:anchorId="5126633F" wp14:editId="589BF095">
+            <wp:extent cx="5760720" cy="3818890"/>
+            <wp:effectExtent l="0" t="0" r="0" b="0"/>
+            <wp:docPr id="344031235" name="Image 1" descr="The image displays a Sentry dashboard interface with various metrics and data, including project details, issue types, user information, and statistics on events, releases, and tags.&#10;&#10;Le contenu généré par l’IA peut être incorrect."/>
+            <wp:cNvGraphicFramePr>
+              <a:graphicFrameLocks xmlns:a="http://schemas.openxmlformats.org/drawingml/2006/main" noChangeAspect="1"/>
+            </wp:cNvGraphicFramePr>
+            <a:graphic xmlns:a="http://schemas.openxmlformats.org/drawingml/2006/main">
+              <a:graphicData uri="http://schemas.openxmlformats.org/drawingml/2006/picture">
+                <pic:pic xmlns:pic="http://schemas.openxmlformats.org/drawingml/2006/picture">
+                  <pic:nvPicPr>
+                    <pic:cNvPr id="344031235" name="Image 1" descr="The image displays a Sentry dashboard interface with various metrics and data, including project details, issue types, user information, and statistics on events, releases, and tags.&#10;&#10;Le contenu généré par l’IA peut être incorrect."/>
+                    <pic:cNvPicPr/>
+                  </pic:nvPicPr>
+                  <pic:blipFill>
+                    <a:blip r:embed="rId11"/>
+                    <a:stretch>
+                      <a:fillRect/>
+                    </a:stretch>
+                  </pic:blipFill>
+                  <pic:spPr>
+                    <a:xfrm>
+                      <a:off x="0" y="0"/>
+                      <a:ext cx="5760720" cy="3818890"/>
                     </a:xfrm>
                     <a:prstGeom prst="rect">
                       <a:avLst/>
@@ -1383,6 +1793,29 @@
       <w:spacing w:val="5"/>
     </w:rPr>
   </w:style>
+  <w:style w:type="character" w:styleId="Lienhypertexte">
+    <w:name w:val="Hyperlink"/>
+    <w:basedOn w:val="Policepardfaut"/>
+    <w:uiPriority w:val="99"/>
+    <w:unhideWhenUsed/>
+    <w:rsid w:val="000102E3"/>
+    <w:rPr>
+      <w:color w:val="467886" w:themeColor="hyperlink"/>
+      <w:u w:val="single"/>
+    </w:rPr>
+  </w:style>
+  <w:style w:type="character" w:styleId="Mentionnonrsolue">
+    <w:name w:val="Unresolved Mention"/>
+    <w:basedOn w:val="Policepardfaut"/>
+    <w:uiPriority w:val="99"/>
+    <w:semiHidden/>
+    <w:unhideWhenUsed/>
+    <w:rsid w:val="000102E3"/>
+    <w:rPr>
+      <w:color w:val="605E5C"/>
+      <w:shd w:val="clear" w:color="auto" w:fill="E1DFDD"/>
+    </w:rPr>
+  </w:style>
 </w:styles>
 </file>
 

</xml_diff>